<commit_message>
Refactor Hibernate entities and add DTOs
Refactored Hibernate entities for Departamento, Proyecto, and Trabaja to improve relationship mapping and PK handling. Removed TrabajaPK in favor of @IdClass in Trabaja. Added DepartamentoDTO for department data transfer. Updated GenericDAO with new methods for department queries and improved save logic. Adjusted Main.java for new entity constructors and test output. Updated hibernate.cfg.xml to include Trabaja mapping.
</commit_message>
<xml_diff>
--- a/Programacion_Multimedia/Tema 2/Proyecto_DDBB_SQLite.docx
+++ b/Programacion_Multimedia/Tema 2/Proyecto_DDBB_SQLite.docx
@@ -1160,13 +1160,8 @@
       <w:r>
         <w:t xml:space="preserve">, nombre (Eléctrico, Diésel, Híbrido), </w:t>
       </w:r>
-      <w:proofErr w:type="spellStart"/>
-      <w:r>
-        <w:t>impuesto_circulacion</w:t>
-      </w:r>
-      <w:proofErr w:type="spellEnd"/>
-      <w:r>
-        <w:t xml:space="preserve">, </w:t>
+      <w:r>
+        <w:t xml:space="preserve">cilindrada, </w:t>
       </w:r>
       <w:proofErr w:type="spellStart"/>
       <w:r>
@@ -1263,15 +1258,18 @@
       </w:r>
     </w:p>
     <w:p>
+      <w:pPr>
+        <w:pStyle w:val="Ttulo2"/>
+      </w:pPr>
       <w:r>
         <w:rPr>
           <w:noProof/>
         </w:rPr>
         <w:drawing>
           <wp:inline distT="0" distB="0" distL="0" distR="0">
-            <wp:extent cx="5130800" cy="3340100"/>
+            <wp:extent cx="5105400" cy="3340100"/>
             <wp:effectExtent l="0" t="0" r="0" b="0"/>
-            <wp:docPr id="660700739" name="Imagen 6" descr="Diagrama&#10;&#10;El contenido generado por IA puede ser incorrecto."/>
+            <wp:docPr id="1583382473" name="Imagen 8" descr="Diagrama&#10;&#10;El contenido generado por IA puede ser incorrecto."/>
             <wp:cNvGraphicFramePr>
               <a:graphicFrameLocks xmlns:a="http://schemas.openxmlformats.org/drawingml/2006/main" noChangeAspect="1"/>
             </wp:cNvGraphicFramePr>
@@ -1279,7 +1277,7 @@
               <a:graphicData uri="http://schemas.openxmlformats.org/drawingml/2006/picture">
                 <pic:pic xmlns:pic="http://schemas.openxmlformats.org/drawingml/2006/picture">
                   <pic:nvPicPr>
-                    <pic:cNvPr id="660700739" name="Imagen 6" descr="Diagrama&#10;&#10;El contenido generado por IA puede ser incorrecto."/>
+                    <pic:cNvPr id="1583382473" name="Imagen 8" descr="Diagrama&#10;&#10;El contenido generado por IA puede ser incorrecto."/>
                     <pic:cNvPicPr/>
                   </pic:nvPicPr>
                   <pic:blipFill>
@@ -1297,7 +1295,7 @@
                   <pic:spPr>
                     <a:xfrm>
                       <a:off x="0" y="0"/>
-                      <a:ext cx="5130800" cy="3340100"/>
+                      <a:ext cx="5105400" cy="3340100"/>
                     </a:xfrm>
                     <a:prstGeom prst="rect">
                       <a:avLst/>
@@ -1312,34 +1310,37 @@
     </w:p>
     <w:p>
       <w:pPr>
+        <w:pStyle w:val="Ttulo2"/>
+      </w:pPr>
+    </w:p>
+    <w:p>
+      <w:pPr>
         <w:jc w:val="left"/>
       </w:pPr>
       <w:r>
         <w:br w:type="page"/>
       </w:r>
     </w:p>
-    <w:p/>
     <w:p>
       <w:pPr>
         <w:pStyle w:val="Ttulo2"/>
       </w:pPr>
       <w:r>
+        <w:lastRenderedPageBreak/>
+        <w:t>Diagrama Entidad-Relación</w:t>
+      </w:r>
+    </w:p>
+    <w:p/>
+    <w:p>
+      <w:r>
         <w:rPr>
           <w:noProof/>
         </w:rPr>
         <w:drawing>
-          <wp:anchor distT="0" distB="0" distL="114300" distR="114300" simplePos="0" relativeHeight="251664384" behindDoc="0" locked="0" layoutInCell="1" allowOverlap="1">
-            <wp:simplePos x="0" y="0"/>
-            <wp:positionH relativeFrom="column">
-              <wp:posOffset>-985715</wp:posOffset>
-            </wp:positionH>
-            <wp:positionV relativeFrom="paragraph">
-              <wp:posOffset>462280</wp:posOffset>
-            </wp:positionV>
-            <wp:extent cx="7408529" cy="1617785"/>
+          <wp:inline distT="0" distB="0" distL="0" distR="0" wp14:anchorId="2FC42D9C" wp14:editId="141697C9">
+            <wp:extent cx="6237301" cy="1409700"/>
             <wp:effectExtent l="0" t="0" r="0" b="0"/>
-            <wp:wrapSquare wrapText="bothSides"/>
-            <wp:docPr id="300839357" name="Imagen 7" descr="Diagrama&#10;&#10;El contenido generado por IA puede ser incorrecto."/>
+            <wp:docPr id="766161929" name="Imagen 9" descr="Diagrama&#10;&#10;El contenido generado por IA puede ser incorrecto."/>
             <wp:cNvGraphicFramePr>
               <a:graphicFrameLocks xmlns:a="http://schemas.openxmlformats.org/drawingml/2006/main" noChangeAspect="1"/>
             </wp:cNvGraphicFramePr>
@@ -1347,7 +1348,7 @@
               <a:graphicData uri="http://schemas.openxmlformats.org/drawingml/2006/picture">
                 <pic:pic xmlns:pic="http://schemas.openxmlformats.org/drawingml/2006/picture">
                   <pic:nvPicPr>
-                    <pic:cNvPr id="300839357" name="Imagen 7" descr="Diagrama&#10;&#10;El contenido generado por IA puede ser incorrecto."/>
+                    <pic:cNvPr id="766161929" name="Imagen 9" descr="Diagrama&#10;&#10;El contenido generado por IA puede ser incorrecto."/>
                     <pic:cNvPicPr/>
                   </pic:nvPicPr>
                   <pic:blipFill>
@@ -1365,7 +1366,7 @@
                   <pic:spPr>
                     <a:xfrm>
                       <a:off x="0" y="0"/>
-                      <a:ext cx="7408529" cy="1617785"/>
+                      <a:ext cx="6382331" cy="1442478"/>
                     </a:xfrm>
                     <a:prstGeom prst="rect">
                       <a:avLst/>
@@ -1374,21 +1375,10 @@
                 </pic:pic>
               </a:graphicData>
             </a:graphic>
-            <wp14:sizeRelH relativeFrom="page">
-              <wp14:pctWidth>0</wp14:pctWidth>
-            </wp14:sizeRelH>
-            <wp14:sizeRelV relativeFrom="page">
-              <wp14:pctHeight>0</wp14:pctHeight>
-            </wp14:sizeRelV>
-          </wp:anchor>
+          </wp:inline>
         </w:drawing>
       </w:r>
-      <w:r>
-        <w:t>Diagrama Entidad-Relación</w:t>
-      </w:r>
     </w:p>
-    <w:p/>
-    <w:p/>
     <w:sectPr>
       <w:headerReference w:type="default" r:id="rId11"/>
       <w:footerReference w:type="default" r:id="rId12"/>

</xml_diff>

<commit_message>
Add delete functionality for cars and improve DAO usage
Implemented car deletion in CocheAdapter and CocheDAO, and improved spinner ID assignment in AddCocheActivity by querying DAOs for real IDs. Added obtenerIdPorNombre methods to MarcaDAO, MotorDAO, and ProveedorDAO for better entity referencing. Minor code cleanups and comments removed for clarity.
</commit_message>
<xml_diff>
--- a/Programacion_Multimedia/Tema 2/Proyecto_DDBB_SQLite.docx
+++ b/Programacion_Multimedia/Tema 2/Proyecto_DDBB_SQLite.docx
@@ -8,7 +8,7 @@
           <w:noProof/>
         </w:rPr>
         <w:drawing>
-          <wp:anchor distT="0" distB="0" distL="114300" distR="114300" simplePos="0" relativeHeight="251659264" behindDoc="1" locked="0" layoutInCell="1" allowOverlap="1" wp14:anchorId="7AAEA8D2" wp14:editId="198F8C2F">
+          <wp:anchor distT="0" distB="0" distL="114300" distR="114300" simplePos="0" relativeHeight="251659264" behindDoc="1" locked="0" layoutInCell="1" allowOverlap="1" wp14:anchorId="1EF060C4" wp14:editId="06BD0198">
             <wp:simplePos x="0" y="0"/>
             <wp:positionH relativeFrom="column">
               <wp:posOffset>-496570</wp:posOffset>
@@ -75,7 +75,7 @@
         <mc:AlternateContent>
           <mc:Choice Requires="wps">
             <w:drawing>
-              <wp:anchor distT="0" distB="0" distL="114300" distR="114300" simplePos="0" relativeHeight="251660288" behindDoc="0" locked="0" layoutInCell="1" allowOverlap="1" wp14:anchorId="33019F59" wp14:editId="604ADC9E">
+              <wp:anchor distT="0" distB="0" distL="114300" distR="114300" simplePos="0" relativeHeight="251660288" behindDoc="0" locked="0" layoutInCell="1" allowOverlap="1" wp14:anchorId="1BF2D526" wp14:editId="4DE7DDBC">
                 <wp:simplePos x="0" y="0"/>
                 <wp:positionH relativeFrom="column">
                   <wp:posOffset>-489585</wp:posOffset>
@@ -125,17 +125,7 @@
                                 <w:sz w:val="110"/>
                                 <w:szCs w:val="110"/>
                               </w:rPr>
-                              <w:t>TÍTULO</w:t>
-                            </w:r>
-                            <w:r>
-                              <w:rPr>
-                                <w:b/>
-                                <w:bCs/>
-                                <w:color w:val="0000CC"/>
-                                <w:sz w:val="110"/>
-                                <w:szCs w:val="110"/>
-                              </w:rPr>
-                              <w:t xml:space="preserve"> </w:t>
+                              <w:t xml:space="preserve">Proyecto </w:t>
                             </w:r>
                           </w:p>
                           <w:p>
@@ -156,7 +146,7 @@
                                 <w:sz w:val="110"/>
                                 <w:szCs w:val="110"/>
                               </w:rPr>
-                              <w:t>Práctica</w:t>
+                              <w:t>SQLite</w:t>
                             </w:r>
                           </w:p>
                         </w:txbxContent>
@@ -181,11 +171,11 @@
           </mc:Choice>
           <mc:Fallback>
             <w:pict>
-              <v:shapetype w14:anchorId="33019F59" id="_x0000_t202" coordsize="21600,21600" o:spt="202" path="m,l,21600r21600,l21600,xe">
+              <v:shapetype w14:anchorId="1BF2D526" id="_x0000_t202" coordsize="21600,21600" o:spt="202" path="m,l,21600r21600,l21600,xe">
                 <v:stroke joinstyle="miter"/>
                 <v:path gradientshapeok="t" o:connecttype="rect"/>
               </v:shapetype>
-              <v:shape id="Text Box 3" o:spid="_x0000_s1026" type="#_x0000_t202" style="position:absolute;left:0;text-align:left;margin-left:-38.55pt;margin-top:311.65pt;width:243pt;height:180pt;z-index:251660288;visibility:visible;mso-wrap-style:square;mso-width-percent:0;mso-height-percent:0;mso-wrap-distance-left:9pt;mso-wrap-distance-top:0;mso-wrap-distance-right:9pt;mso-wrap-distance-bottom:0;mso-position-horizontal:absolute;mso-position-horizontal-relative:text;mso-position-vertical:absolute;mso-position-vertical-relative:text;mso-width-percent:0;mso-height-percent:0;mso-width-relative:margin;mso-height-relative:margin;v-text-anchor:top" o:gfxdata="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" filled="f" stroked="f" strokeweight=".5pt">
+              <v:shape id="Text Box 3" o:spid="_x0000_s1026" type="#_x0000_t202" style="position:absolute;left:0;text-align:left;margin-left:-38.55pt;margin-top:311.65pt;width:243pt;height:180pt;z-index:251660288;visibility:visible;mso-wrap-style:square;mso-width-percent:0;mso-height-percent:0;mso-wrap-distance-left:9pt;mso-wrap-distance-top:0;mso-wrap-distance-right:9pt;mso-wrap-distance-bottom:0;mso-position-horizontal:absolute;mso-position-horizontal-relative:text;mso-position-vertical:absolute;mso-position-vertical-relative:text;mso-width-percent:0;mso-height-percent:0;mso-width-relative:margin;mso-height-relative:margin;v-text-anchor:top" o:gfxdata="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" filled="f" stroked="f" strokeweight=".5pt">
                 <v:textbox>
                   <w:txbxContent>
                     <w:p>
@@ -206,17 +196,7 @@
                           <w:sz w:val="110"/>
                           <w:szCs w:val="110"/>
                         </w:rPr>
-                        <w:t>TÍTULO</w:t>
-                      </w:r>
-                      <w:r>
-                        <w:rPr>
-                          <w:b/>
-                          <w:bCs/>
-                          <w:color w:val="0000CC"/>
-                          <w:sz w:val="110"/>
-                          <w:szCs w:val="110"/>
-                        </w:rPr>
-                        <w:t xml:space="preserve"> </w:t>
+                        <w:t xml:space="preserve">Proyecto </w:t>
                       </w:r>
                     </w:p>
                     <w:p>
@@ -237,7 +217,7 @@
                           <w:sz w:val="110"/>
                           <w:szCs w:val="110"/>
                         </w:rPr>
-                        <w:t>Práctica</w:t>
+                        <w:t>SQLite</w:t>
                       </w:r>
                     </w:p>
                   </w:txbxContent>
@@ -254,7 +234,7 @@
         <mc:AlternateContent>
           <mc:Choice Requires="wps">
             <w:drawing>
-              <wp:anchor distT="0" distB="0" distL="114300" distR="114300" simplePos="0" relativeHeight="251663360" behindDoc="1" locked="0" layoutInCell="1" allowOverlap="1" wp14:anchorId="32FE7796" wp14:editId="673E7554">
+              <wp:anchor distT="0" distB="0" distL="114300" distR="114300" simplePos="0" relativeHeight="251663360" behindDoc="1" locked="0" layoutInCell="1" allowOverlap="1" wp14:anchorId="53324159" wp14:editId="4A01DB2F">
                 <wp:simplePos x="0" y="0"/>
                 <wp:positionH relativeFrom="column">
                   <wp:posOffset>-1194435</wp:posOffset>
@@ -336,7 +316,7 @@
                   <v:h position="#0,topLeft" xrange="0,21600"/>
                 </v:handles>
               </v:shapetype>
-              <v:shape id="Isosceles Triangle 5" o:spid="_x0000_s1026" type="#_x0000_t5" style="position:absolute;margin-left:-94.05pt;margin-top:674.65pt;width:115.9pt;height:99.9pt;z-index:-251653120;visibility:visible;mso-wrap-style:square;mso-width-percent:0;mso-height-percent:0;mso-wrap-distance-left:9pt;mso-wrap-distance-top:0;mso-wrap-distance-right:9pt;mso-wrap-distance-bottom:0;mso-position-horizontal:absolute;mso-position-horizontal-relative:text;mso-position-vertical:absolute;mso-position-vertical-relative:text;mso-width-percent:0;mso-height-percent:0;mso-width-relative:margin;mso-height-relative:margin;v-text-anchor:middle" o:gfxdata="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" adj="0" fillcolor="#00c" stroked="f" strokeweight="1pt"/>
+              <v:shape id="Isosceles Triangle 5" o:spid="_x0000_s1026" type="#_x0000_t5" style="position:absolute;margin-left:-94.05pt;margin-top:674.65pt;width:115.9pt;height:99.9pt;z-index:-251653120;visibility:visible;mso-wrap-style:square;mso-width-percent:0;mso-height-percent:0;mso-wrap-distance-left:9pt;mso-wrap-distance-top:0;mso-wrap-distance-right:9pt;mso-wrap-distance-bottom:0;mso-position-horizontal:absolute;mso-position-horizontal-relative:text;mso-position-vertical:absolute;mso-position-vertical-relative:text;mso-width-percent:0;mso-height-percent:0;mso-width-relative:margin;mso-height-relative:margin;v-text-anchor:middle" o:gfxdata="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" adj="0" fillcolor="#00c" stroked="f" strokeweight="1pt"/>
             </w:pict>
           </mc:Fallback>
         </mc:AlternateContent>
@@ -348,7 +328,7 @@
         <mc:AlternateContent>
           <mc:Choice Requires="wps">
             <w:drawing>
-              <wp:anchor distT="0" distB="0" distL="114300" distR="114300" simplePos="0" relativeHeight="251662336" behindDoc="0" locked="0" layoutInCell="1" allowOverlap="1" wp14:anchorId="62280E6D" wp14:editId="35BE4F8E">
+              <wp:anchor distT="0" distB="0" distL="114300" distR="114300" simplePos="0" relativeHeight="251662336" behindDoc="0" locked="0" layoutInCell="1" allowOverlap="1" wp14:anchorId="44426A79" wp14:editId="42FB79FA">
                 <wp:simplePos x="0" y="0"/>
                 <wp:positionH relativeFrom="column">
                   <wp:posOffset>-492760</wp:posOffset>
@@ -438,7 +418,7 @@
                   <v:h position="#0,topLeft" xrange="0,21600"/>
                 </v:handles>
               </v:shapetype>
-              <v:shape id="Parallelogram 4" o:spid="_x0000_s1026" type="#_x0000_t7" style="position:absolute;margin-left:-38.8pt;margin-top:611.35pt;width:286.35pt;height:7.5pt;z-index:251662336;visibility:visible;mso-wrap-style:square;mso-width-percent:0;mso-height-percent:0;mso-wrap-distance-left:9pt;mso-wrap-distance-top:0;mso-wrap-distance-right:9pt;mso-wrap-distance-bottom:0;mso-position-horizontal:absolute;mso-position-horizontal-relative:text;mso-position-vertical:absolute;mso-position-vertical-relative:text;mso-width-percent:0;mso-height-percent:0;mso-width-relative:margin;mso-height-relative:margin;v-text-anchor:middle" o:gfxdata="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" adj="141" fillcolor="#0b1023" stroked="f" strokeweight="1pt"/>
+              <v:shape id="Parallelogram 4" o:spid="_x0000_s1026" type="#_x0000_t7" style="position:absolute;margin-left:-38.8pt;margin-top:611.35pt;width:286.35pt;height:7.5pt;z-index:251662336;visibility:visible;mso-wrap-style:square;mso-width-percent:0;mso-height-percent:0;mso-wrap-distance-left:9pt;mso-wrap-distance-top:0;mso-wrap-distance-right:9pt;mso-wrap-distance-bottom:0;mso-position-horizontal:absolute;mso-position-horizontal-relative:text;mso-position-vertical:absolute;mso-position-vertical-relative:text;mso-width-percent:0;mso-height-percent:0;mso-width-relative:margin;mso-height-relative:margin;v-text-anchor:middle" o:gfxdata="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" adj="141" fillcolor="#0b1023" stroked="f" strokeweight="1pt"/>
             </w:pict>
           </mc:Fallback>
         </mc:AlternateContent>
@@ -450,7 +430,7 @@
         <mc:AlternateContent>
           <mc:Choice Requires="wps">
             <w:drawing>
-              <wp:anchor distT="0" distB="0" distL="114300" distR="114300" simplePos="0" relativeHeight="251661312" behindDoc="0" locked="0" layoutInCell="1" allowOverlap="1" wp14:anchorId="60FEB9E6" wp14:editId="272E990D">
+              <wp:anchor distT="0" distB="0" distL="114300" distR="114300" simplePos="0" relativeHeight="251661312" behindDoc="0" locked="0" layoutInCell="1" allowOverlap="1" wp14:anchorId="44833360" wp14:editId="7856D59E">
                 <wp:simplePos x="0" y="0"/>
                 <wp:positionH relativeFrom="column">
                   <wp:posOffset>-496570</wp:posOffset>
@@ -585,7 +565,7 @@
           </mc:Choice>
           <mc:Fallback>
             <w:pict>
-              <v:shape w14:anchorId="60FEB9E6" id="_x0000_s1027" type="#_x0000_t202" style="position:absolute;left:0;text-align:left;margin-left:-39.1pt;margin-top:494.95pt;width:299.15pt;height:98.05pt;z-index:251661312;visibility:visible;mso-wrap-style:square;mso-width-percent:0;mso-height-percent:0;mso-wrap-distance-left:9pt;mso-wrap-distance-top:0;mso-wrap-distance-right:9pt;mso-wrap-distance-bottom:0;mso-position-horizontal:absolute;mso-position-horizontal-relative:text;mso-position-vertical:absolute;mso-position-vertical-relative:text;mso-width-percent:0;mso-height-percent:0;mso-width-relative:margin;mso-height-relative:margin;v-text-anchor:top" o:gfxdata="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" filled="f" stroked="f" strokeweight=".5pt">
+              <v:shape w14:anchorId="44833360" id="_x0000_s1027" type="#_x0000_t202" style="position:absolute;left:0;text-align:left;margin-left:-39.1pt;margin-top:494.95pt;width:299.15pt;height:98.05pt;z-index:251661312;visibility:visible;mso-wrap-style:square;mso-width-percent:0;mso-height-percent:0;mso-wrap-distance-left:9pt;mso-wrap-distance-top:0;mso-wrap-distance-right:9pt;mso-wrap-distance-bottom:0;mso-position-horizontal:absolute;mso-position-horizontal-relative:text;mso-position-vertical:absolute;mso-position-vertical-relative:text;mso-width-percent:0;mso-height-percent:0;mso-width-relative:margin;mso-height-relative:margin;v-text-anchor:top" o:gfxdata="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" filled="f" stroked="f" strokeweight=".5pt">
                 <v:textbox>
                   <w:txbxContent>
                     <w:p>
@@ -719,7 +699,7 @@
               <w:noProof/>
               <w:kern w:val="2"/>
               <w:szCs w:val="24"/>
-              <w:lang w:eastAsia="es-ES_tradnl"/>
+              <w:lang w:eastAsia="es-ES"/>
             </w:rPr>
           </w:pPr>
           <w:r>
@@ -731,7 +711,7 @@
           <w:r>
             <w:fldChar w:fldCharType="separate"/>
           </w:r>
-          <w:hyperlink w:anchor="_Toc215220560" w:history="1">
+          <w:hyperlink w:anchor="_Toc216285749" w:history="1">
             <w:r>
               <w:rPr>
                 <w:rStyle w:val="Hipervnculo"/>
@@ -758,7 +738,7 @@
                 <w:noProof/>
                 <w:webHidden/>
               </w:rPr>
-              <w:instrText xml:space="preserve"> PAGEREF _Toc215220560 \h </w:instrText>
+              <w:instrText xml:space="preserve"> PAGEREF _Toc216285749 \h </w:instrText>
             </w:r>
             <w:r>
               <w:rPr>
@@ -800,16 +780,30 @@
               <w:noProof/>
               <w:kern w:val="2"/>
               <w:szCs w:val="24"/>
-              <w:lang w:eastAsia="es-ES_tradnl"/>
+              <w:lang w:eastAsia="es-ES"/>
             </w:rPr>
           </w:pPr>
-          <w:hyperlink w:anchor="_Toc215220561" w:history="1">
+          <w:hyperlink w:anchor="_Toc216285750" w:history="1">
             <w:r>
               <w:rPr>
                 <w:rStyle w:val="Hipervnculo"/>
                 <w:noProof/>
               </w:rPr>
-              <w:t>Concesionario de Coches (Gestión de Stock)</w:t>
+              <w:t>Concesionario de Coches (Ge</w:t>
+            </w:r>
+            <w:r>
+              <w:rPr>
+                <w:rStyle w:val="Hipervnculo"/>
+                <w:noProof/>
+              </w:rPr>
+              <w:t>s</w:t>
+            </w:r>
+            <w:r>
+              <w:rPr>
+                <w:rStyle w:val="Hipervnculo"/>
+                <w:noProof/>
+              </w:rPr>
+              <w:t>tión de Stock)</w:t>
             </w:r>
             <w:r>
               <w:rPr>
@@ -830,7 +824,7 @@
                 <w:noProof/>
                 <w:webHidden/>
               </w:rPr>
-              <w:instrText xml:space="preserve"> PAGEREF _Toc215220561 \h </w:instrText>
+              <w:instrText xml:space="preserve"> PAGEREF _Toc216285750 \h </w:instrText>
             </w:r>
             <w:r>
               <w:rPr>
@@ -868,10 +862,14 @@
               <w:tab w:val="right" w:leader="dot" w:pos="8494"/>
             </w:tabs>
             <w:rPr>
+              <w:rFonts w:eastAsiaTheme="minorEastAsia"/>
               <w:noProof/>
+              <w:kern w:val="2"/>
+              <w:szCs w:val="24"/>
+              <w:lang w:eastAsia="es-ES"/>
             </w:rPr>
           </w:pPr>
-          <w:hyperlink w:anchor="_Toc215220562" w:history="1">
+          <w:hyperlink w:anchor="_Toc216285751" w:history="1">
             <w:r>
               <w:rPr>
                 <w:rStyle w:val="Hipervnculo"/>
@@ -898,7 +896,7 @@
                 <w:noProof/>
                 <w:webHidden/>
               </w:rPr>
-              <w:instrText xml:space="preserve"> PAGEREF _Toc215220562 \h </w:instrText>
+              <w:instrText xml:space="preserve"> PAGEREF _Toc216285751 \h </w:instrText>
             </w:r>
             <w:r>
               <w:rPr>
@@ -936,10 +934,14 @@
               <w:tab w:val="right" w:leader="dot" w:pos="8494"/>
             </w:tabs>
             <w:rPr>
+              <w:rFonts w:eastAsiaTheme="minorEastAsia"/>
               <w:noProof/>
+              <w:kern w:val="2"/>
+              <w:szCs w:val="24"/>
+              <w:lang w:eastAsia="es-ES"/>
             </w:rPr>
           </w:pPr>
-          <w:hyperlink w:anchor="_Toc215220563" w:history="1">
+          <w:hyperlink w:anchor="_Toc216285752" w:history="1">
             <w:r>
               <w:rPr>
                 <w:rStyle w:val="Hipervnculo"/>
@@ -966,7 +968,7 @@
                 <w:noProof/>
                 <w:webHidden/>
               </w:rPr>
-              <w:instrText xml:space="preserve"> PAGEREF _Toc215220563 \h </w:instrText>
+              <w:instrText xml:space="preserve"> PAGEREF _Toc216285752 \h </w:instrText>
             </w:r>
             <w:r>
               <w:rPr>
@@ -987,6 +989,222 @@
                 <w:webHidden/>
               </w:rPr>
               <w:t>3</w:t>
+            </w:r>
+            <w:r>
+              <w:rPr>
+                <w:noProof/>
+                <w:webHidden/>
+              </w:rPr>
+              <w:fldChar w:fldCharType="end"/>
+            </w:r>
+          </w:hyperlink>
+        </w:p>
+        <w:p>
+          <w:pPr>
+            <w:pStyle w:val="TDC2"/>
+            <w:tabs>
+              <w:tab w:val="right" w:leader="dot" w:pos="8494"/>
+            </w:tabs>
+            <w:rPr>
+              <w:rFonts w:eastAsiaTheme="minorEastAsia"/>
+              <w:noProof/>
+              <w:kern w:val="2"/>
+              <w:szCs w:val="24"/>
+              <w:lang w:eastAsia="es-ES"/>
+            </w:rPr>
+          </w:pPr>
+          <w:hyperlink w:anchor="_Toc216285753" w:history="1">
+            <w:r>
+              <w:rPr>
+                <w:rStyle w:val="Hipervnculo"/>
+                <w:noProof/>
+              </w:rPr>
+              <w:t>Diagrama de clases</w:t>
+            </w:r>
+            <w:r>
+              <w:rPr>
+                <w:noProof/>
+                <w:webHidden/>
+              </w:rPr>
+              <w:tab/>
+            </w:r>
+            <w:r>
+              <w:rPr>
+                <w:noProof/>
+                <w:webHidden/>
+              </w:rPr>
+              <w:fldChar w:fldCharType="begin"/>
+            </w:r>
+            <w:r>
+              <w:rPr>
+                <w:noProof/>
+                <w:webHidden/>
+              </w:rPr>
+              <w:instrText xml:space="preserve"> PAGEREF _Toc216285753 \h </w:instrText>
+            </w:r>
+            <w:r>
+              <w:rPr>
+                <w:noProof/>
+                <w:webHidden/>
+              </w:rPr>
+            </w:r>
+            <w:r>
+              <w:rPr>
+                <w:noProof/>
+                <w:webHidden/>
+              </w:rPr>
+              <w:fldChar w:fldCharType="separate"/>
+            </w:r>
+            <w:r>
+              <w:rPr>
+                <w:noProof/>
+                <w:webHidden/>
+              </w:rPr>
+              <w:t>3</w:t>
+            </w:r>
+            <w:r>
+              <w:rPr>
+                <w:noProof/>
+                <w:webHidden/>
+              </w:rPr>
+              <w:fldChar w:fldCharType="end"/>
+            </w:r>
+          </w:hyperlink>
+        </w:p>
+        <w:p>
+          <w:pPr>
+            <w:pStyle w:val="TDC2"/>
+            <w:tabs>
+              <w:tab w:val="right" w:leader="dot" w:pos="8494"/>
+            </w:tabs>
+            <w:rPr>
+              <w:rFonts w:eastAsiaTheme="minorEastAsia"/>
+              <w:noProof/>
+              <w:kern w:val="2"/>
+              <w:szCs w:val="24"/>
+              <w:lang w:eastAsia="es-ES"/>
+            </w:rPr>
+          </w:pPr>
+          <w:hyperlink w:anchor="_Toc216285754" w:history="1">
+            <w:r>
+              <w:rPr>
+                <w:rStyle w:val="Hipervnculo"/>
+                <w:noProof/>
+              </w:rPr>
+              <w:t>Diagrama Entidad-Relación</w:t>
+            </w:r>
+            <w:r>
+              <w:rPr>
+                <w:noProof/>
+                <w:webHidden/>
+              </w:rPr>
+              <w:tab/>
+            </w:r>
+            <w:r>
+              <w:rPr>
+                <w:noProof/>
+                <w:webHidden/>
+              </w:rPr>
+              <w:fldChar w:fldCharType="begin"/>
+            </w:r>
+            <w:r>
+              <w:rPr>
+                <w:noProof/>
+                <w:webHidden/>
+              </w:rPr>
+              <w:instrText xml:space="preserve"> PAGEREF _Toc216285754 \h </w:instrText>
+            </w:r>
+            <w:r>
+              <w:rPr>
+                <w:noProof/>
+                <w:webHidden/>
+              </w:rPr>
+            </w:r>
+            <w:r>
+              <w:rPr>
+                <w:noProof/>
+                <w:webHidden/>
+              </w:rPr>
+              <w:fldChar w:fldCharType="separate"/>
+            </w:r>
+            <w:r>
+              <w:rPr>
+                <w:noProof/>
+                <w:webHidden/>
+              </w:rPr>
+              <w:t>4</w:t>
+            </w:r>
+            <w:r>
+              <w:rPr>
+                <w:noProof/>
+                <w:webHidden/>
+              </w:rPr>
+              <w:fldChar w:fldCharType="end"/>
+            </w:r>
+          </w:hyperlink>
+        </w:p>
+        <w:p>
+          <w:pPr>
+            <w:pStyle w:val="TDC2"/>
+            <w:tabs>
+              <w:tab w:val="right" w:leader="dot" w:pos="8494"/>
+            </w:tabs>
+            <w:rPr>
+              <w:rFonts w:eastAsiaTheme="minorEastAsia"/>
+              <w:noProof/>
+              <w:kern w:val="2"/>
+              <w:szCs w:val="24"/>
+              <w:lang w:eastAsia="es-ES"/>
+            </w:rPr>
+          </w:pPr>
+          <w:hyperlink w:anchor="_Toc216285755" w:history="1">
+            <w:r>
+              <w:rPr>
+                <w:rStyle w:val="Hipervnculo"/>
+                <w:noProof/>
+              </w:rPr>
+              <w:t>Estructura básica</w:t>
+            </w:r>
+            <w:r>
+              <w:rPr>
+                <w:noProof/>
+                <w:webHidden/>
+              </w:rPr>
+              <w:tab/>
+            </w:r>
+            <w:r>
+              <w:rPr>
+                <w:noProof/>
+                <w:webHidden/>
+              </w:rPr>
+              <w:fldChar w:fldCharType="begin"/>
+            </w:r>
+            <w:r>
+              <w:rPr>
+                <w:noProof/>
+                <w:webHidden/>
+              </w:rPr>
+              <w:instrText xml:space="preserve"> PAGEREF _Toc216285755 \h </w:instrText>
+            </w:r>
+            <w:r>
+              <w:rPr>
+                <w:noProof/>
+                <w:webHidden/>
+              </w:rPr>
+            </w:r>
+            <w:r>
+              <w:rPr>
+                <w:noProof/>
+                <w:webHidden/>
+              </w:rPr>
+              <w:fldChar w:fldCharType="separate"/>
+            </w:r>
+            <w:r>
+              <w:rPr>
+                <w:noProof/>
+                <w:webHidden/>
+              </w:rPr>
+              <w:t>4</w:t>
             </w:r>
             <w:r>
               <w:rPr>
@@ -1020,7 +1238,7 @@
       <w:pPr>
         <w:pStyle w:val="Ttulo1"/>
       </w:pPr>
-      <w:bookmarkStart w:id="0" w:name="_Toc215220560"/>
+      <w:bookmarkStart w:id="0" w:name="_Toc216285749"/>
       <w:r>
         <w:lastRenderedPageBreak/>
         <w:t xml:space="preserve">Proyecto BBDD SQLite - </w:t>
@@ -1036,17 +1254,30 @@
       <w:pPr>
         <w:pStyle w:val="Ttulo2"/>
       </w:pPr>
-      <w:bookmarkStart w:id="1" w:name="_Toc215220561"/>
+      <w:bookmarkStart w:id="1" w:name="_Toc216285750"/>
       <w:r>
         <w:t>Concesionario de Coches (Gestión de Stock)</w:t>
       </w:r>
       <w:bookmarkEnd w:id="1"/>
+    </w:p>
+    <w:p>
+      <w:r>
+        <w:t xml:space="preserve">La </w:t>
+      </w:r>
+      <w:proofErr w:type="gramStart"/>
+      <w:r>
+        <w:t>app</w:t>
+      </w:r>
+      <w:proofErr w:type="gramEnd"/>
+      <w:r>
+        <w:t xml:space="preserve"> se basa en añadir, editar y eliminar una base de datos de coches.</w:t>
+      </w:r>
     </w:p>
     <w:p>
       <w:pPr>
         <w:pStyle w:val="Ttulo3"/>
       </w:pPr>
-      <w:bookmarkStart w:id="2" w:name="_Toc215220562"/>
+      <w:bookmarkStart w:id="2" w:name="_Toc216285751"/>
       <w:r>
         <w:t>Tablas:</w:t>
       </w:r>
@@ -1228,7 +1459,7 @@
       <w:pPr>
         <w:pStyle w:val="Ttulo3"/>
       </w:pPr>
-      <w:bookmarkStart w:id="3" w:name="_Toc215220563"/>
+      <w:bookmarkStart w:id="3" w:name="_Toc216285752"/>
       <w:r>
         <w:t>Relaciones (1-N):</w:t>
       </w:r>
@@ -1253,20 +1484,19 @@
       <w:pPr>
         <w:pStyle w:val="Ttulo2"/>
       </w:pPr>
+      <w:bookmarkStart w:id="4" w:name="_Toc216285753"/>
       <w:r>
         <w:t>Diagrama de clases</w:t>
       </w:r>
+      <w:bookmarkEnd w:id="4"/>
     </w:p>
     <w:p>
-      <w:pPr>
-        <w:pStyle w:val="Ttulo2"/>
-      </w:pPr>
       <w:r>
         <w:rPr>
           <w:noProof/>
         </w:rPr>
         <w:drawing>
-          <wp:inline distT="0" distB="0" distL="0" distR="0">
+          <wp:inline distT="0" distB="0" distL="0" distR="0" wp14:anchorId="364E163F" wp14:editId="6CB82E80">
             <wp:extent cx="5105400" cy="3340100"/>
             <wp:effectExtent l="0" t="0" r="0" b="0"/>
             <wp:docPr id="1583382473" name="Imagen 8" descr="Diagrama&#10;&#10;El contenido generado por IA puede ser incorrecto."/>
@@ -1325,10 +1555,12 @@
       <w:pPr>
         <w:pStyle w:val="Ttulo2"/>
       </w:pPr>
+      <w:bookmarkStart w:id="5" w:name="_Toc216285754"/>
       <w:r>
         <w:lastRenderedPageBreak/>
         <w:t>Diagrama Entidad-Relación</w:t>
       </w:r>
+      <w:bookmarkEnd w:id="5"/>
     </w:p>
     <w:p/>
     <w:p>
@@ -1337,7 +1569,7 @@
           <w:noProof/>
         </w:rPr>
         <w:drawing>
-          <wp:inline distT="0" distB="0" distL="0" distR="0" wp14:anchorId="2FC42D9C" wp14:editId="141697C9">
+          <wp:inline distT="0" distB="0" distL="0" distR="0" wp14:anchorId="70DCC681" wp14:editId="60B8332E">
             <wp:extent cx="6237301" cy="1409700"/>
             <wp:effectExtent l="0" t="0" r="0" b="0"/>
             <wp:docPr id="766161929" name="Imagen 9" descr="Diagrama&#10;&#10;El contenido generado por IA puede ser incorrecto."/>
@@ -1379,9 +1611,122 @@
         </w:drawing>
       </w:r>
     </w:p>
+    <w:p/>
+    <w:p/>
+    <w:p>
+      <w:pPr>
+        <w:pStyle w:val="Ttulo2"/>
+      </w:pPr>
+      <w:bookmarkStart w:id="6" w:name="_Toc216285755"/>
+      <w:r>
+        <w:t>Estructura básica</w:t>
+      </w:r>
+      <w:bookmarkEnd w:id="6"/>
+    </w:p>
+    <w:p>
+      <w:r>
+        <w:drawing>
+          <wp:inline distT="0" distB="0" distL="0" distR="0" wp14:anchorId="6F78777A" wp14:editId="569B82D3">
+            <wp:extent cx="2326553" cy="5180025"/>
+            <wp:effectExtent l="0" t="0" r="0" b="1905"/>
+            <wp:docPr id="159371727" name="Imagen 1" descr="Captura de pantalla de un celular&#10;&#10;El contenido generado por IA puede ser incorrecto."/>
+            <wp:cNvGraphicFramePr>
+              <a:graphicFrameLocks xmlns:a="http://schemas.openxmlformats.org/drawingml/2006/main" noChangeAspect="1"/>
+            </wp:cNvGraphicFramePr>
+            <a:graphic xmlns:a="http://schemas.openxmlformats.org/drawingml/2006/main">
+              <a:graphicData uri="http://schemas.openxmlformats.org/drawingml/2006/picture">
+                <pic:pic xmlns:pic="http://schemas.openxmlformats.org/drawingml/2006/picture">
+                  <pic:nvPicPr>
+                    <pic:cNvPr id="159371727" name="Imagen 1" descr="Captura de pantalla de un celular&#10;&#10;El contenido generado por IA puede ser incorrecto."/>
+                    <pic:cNvPicPr/>
+                  </pic:nvPicPr>
+                  <pic:blipFill>
+                    <a:blip r:embed="rId11"/>
+                    <a:stretch>
+                      <a:fillRect/>
+                    </a:stretch>
+                  </pic:blipFill>
+                  <pic:spPr>
+                    <a:xfrm>
+                      <a:off x="0" y="0"/>
+                      <a:ext cx="2329801" cy="5187256"/>
+                    </a:xfrm>
+                    <a:prstGeom prst="rect">
+                      <a:avLst/>
+                    </a:prstGeom>
+                  </pic:spPr>
+                </pic:pic>
+              </a:graphicData>
+            </a:graphic>
+          </wp:inline>
+        </w:drawing>
+      </w:r>
+    </w:p>
+    <w:p>
+      <w:pPr>
+        <w:rPr>
+          <w:u w:val="single"/>
+        </w:rPr>
+      </w:pPr>
+      <w:r>
+        <w:t xml:space="preserve">En mi </w:t>
+      </w:r>
+      <w:proofErr w:type="gramStart"/>
+      <w:r>
+        <w:t>app</w:t>
+      </w:r>
+      <w:proofErr w:type="gramEnd"/>
+      <w:r>
+        <w:t xml:space="preserve"> encontramos 3 </w:t>
+      </w:r>
+      <w:proofErr w:type="spellStart"/>
+      <w:r>
+        <w:t>activities</w:t>
+      </w:r>
+      <w:proofErr w:type="spellEnd"/>
+      <w:r>
+        <w:t xml:space="preserve">, una donde muestra el </w:t>
+      </w:r>
+      <w:proofErr w:type="spellStart"/>
+      <w:r>
+        <w:t>recyclerView</w:t>
+      </w:r>
+      <w:proofErr w:type="spellEnd"/>
+      <w:r>
+        <w:t xml:space="preserve"> de los coches.</w:t>
+      </w:r>
+      <w:r>
+        <w:br/>
+        <w:t xml:space="preserve">Luego otra donde se editan los datos de un coche en concreto y luego otra para añadir </w:t>
+      </w:r>
+      <w:r>
+        <w:lastRenderedPageBreak/>
+        <w:t xml:space="preserve">los coches a la </w:t>
+      </w:r>
+      <w:proofErr w:type="spellStart"/>
+      <w:r>
+        <w:t>bbdd</w:t>
+      </w:r>
+      <w:proofErr w:type="spellEnd"/>
+      <w:r>
+        <w:t>.</w:t>
+      </w:r>
+      <w:r>
+        <w:br/>
+      </w:r>
+      <w:r>
+        <w:br/>
+        <w:t xml:space="preserve">Encontramos una carpeta con todas las entidades de la </w:t>
+      </w:r>
+      <w:proofErr w:type="spellStart"/>
+      <w:r>
+        <w:t>bbdd</w:t>
+      </w:r>
+      <w:proofErr w:type="spellEnd"/>
+    </w:p>
     <w:sectPr>
-      <w:headerReference w:type="default" r:id="rId11"/>
-      <w:footerReference w:type="default" r:id="rId12"/>
+      <w:headerReference w:type="default" r:id="rId12"/>
+      <w:footerReference w:type="default" r:id="rId13"/>
       <w:pgSz w:w="11906" w:h="16838"/>
       <w:pgMar w:top="1417" w:right="1701" w:bottom="1417" w:left="1701" w:header="708" w:footer="708" w:gutter="0"/>
       <w:cols w:space="708"/>
@@ -1446,7 +1791,7 @@
           <mc:AlternateContent>
             <mc:Choice Requires="wps">
               <w:drawing>
-                <wp:anchor distT="0" distB="0" distL="114300" distR="114300" simplePos="0" relativeHeight="251659264" behindDoc="1" locked="0" layoutInCell="1" allowOverlap="1" wp14:anchorId="2E65A928" wp14:editId="0D17386E">
+                <wp:anchor distT="0" distB="0" distL="114300" distR="114300" simplePos="0" relativeHeight="251659264" behindDoc="1" locked="0" layoutInCell="1" allowOverlap="1" wp14:anchorId="1709B028" wp14:editId="69B7A5D3">
                   <wp:simplePos x="0" y="0"/>
                   <wp:positionH relativeFrom="rightMargin">
                     <wp:posOffset>0</wp:posOffset>
@@ -1528,7 +1873,7 @@
                     <v:h position="#0,topLeft" xrange="0,21600"/>
                   </v:handles>
                 </v:shapetype>
-                <v:shape id="Isosceles Triangle 5" o:spid="_x0000_s1026" type="#_x0000_t5" style="position:absolute;margin-left:0;margin-top:-6.1pt;width:84.95pt;height:70.5pt;flip:x;z-index:-251657216;visibility:visible;mso-wrap-style:square;mso-width-percent:0;mso-height-percent:0;mso-wrap-distance-left:9pt;mso-wrap-distance-top:0;mso-wrap-distance-right:9pt;mso-wrap-distance-bottom:0;mso-position-horizontal:absolute;mso-position-horizontal-relative:right-margin-area;mso-position-vertical:absolute;mso-position-vertical-relative:text;mso-width-percent:0;mso-height-percent:0;mso-width-relative:margin;mso-height-relative:margin;v-text-anchor:middle" o:gfxdata="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" adj="0" fillcolor="#00c" stroked="f" strokeweight="1pt">
+                <v:shape id="Isosceles Triangle 5" o:spid="_x0000_s1026" type="#_x0000_t5" style="position:absolute;margin-left:0;margin-top:-6.1pt;width:84.95pt;height:70.5pt;flip:x;z-index:-251657216;visibility:visible;mso-wrap-style:square;mso-width-percent:0;mso-height-percent:0;mso-wrap-distance-left:9pt;mso-wrap-distance-top:0;mso-wrap-distance-right:9pt;mso-wrap-distance-bottom:0;mso-position-horizontal:absolute;mso-position-horizontal-relative:right-margin-area;mso-position-vertical:absolute;mso-position-vertical-relative:text;mso-width-percent:0;mso-height-percent:0;mso-width-relative:margin;mso-height-relative:margin;v-text-anchor:middle" o:gfxdata="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" adj="0" fillcolor="#00c" stroked="f" strokeweight="1pt">
                   <w10:wrap anchorx="margin"/>
                 </v:shape>
               </w:pict>

</xml_diff>